<commit_message>
routing phase timed challenge
</commit_message>
<xml_diff>
--- a/day 28/Routing Phase Timed Challenge.docx
+++ b/day 28/Routing Phase Timed Challenge.docx
@@ -179,6 +179,26 @@
       </w:r>
       <w:r>
         <w:t xml:space="preserve"> This is defined as at least one active physical port (switchport mode access) associated with that VLAN ID that has an Up/Up line protocol. Without this, the switch assumes the VLAN is "dead" and will not route for it.</w:t>
+      </w:r>
+    </w:p>
+    <w:p>
+      <w:r>
+        <w:t>Int fa 0/2</w:t>
+      </w:r>
+    </w:p>
+    <w:p>
+      <w:r>
+        <w:t>Sw mode access</w:t>
+      </w:r>
+    </w:p>
+    <w:p>
+      <w:r>
+        <w:t xml:space="preserve">Sw access vlan 20 </w:t>
+      </w:r>
+    </w:p>
+    <w:p>
+      <w:r>
+        <w:t>(not only through default gateway but the sw also needs to be configured separately so they know which port )</w:t>
       </w:r>
     </w:p>
     <w:p>
@@ -2113,6 +2133,7 @@
   <w:style w:type="character" w:default="1" w:styleId="DefaultParagraphFont">
     <w:name w:val="Default Paragraph Font"/>
     <w:uiPriority w:val="1"/>
+    <w:semiHidden/>
     <w:unhideWhenUsed/>
   </w:style>
   <w:style w:type="table" w:default="1" w:styleId="TableNormal">

</xml_diff>